<commit_message>
Card 11 - Lidando com dados do mundo real
Relatório com o conhecimento adquirido nas duas seções do curso Machine Learning, Data Science and Generative AI with Python.
Código da aula.
Correção do Relatório 7.
Mundança da código da aula do card 9.
</commit_message>
<xml_diff>
--- a/I - Fundamentos Aprendizado de Máquina/Cards/Card 7 - Mergulho nas IDEs Online para Aprendizado de Máquina/Relatório/Relatório 7 - Edryck Nascimento.docx
+++ b/I - Fundamentos Aprendizado de Máquina/Cards/Card 7 - Mergulho nas IDEs Online para Aprendizado de Máquina/Relatório/Relatório 7 - Edryck Nascimento.docx
@@ -148,6 +148,8 @@
       <w:proofErr w:type="spellStart"/>
       <w:r>
         <w:rPr>
+          <w:i/>
+          <w:iCs/>
           <w:sz w:val="24"/>
           <w:szCs w:val="24"/>
         </w:rPr>
@@ -156,6 +158,8 @@
       <w:proofErr w:type="spellEnd"/>
       <w:r>
         <w:rPr>
+          <w:i/>
+          <w:iCs/>
           <w:sz w:val="24"/>
           <w:szCs w:val="24"/>
         </w:rPr>
@@ -164,6 +168,8 @@
       <w:proofErr w:type="spellStart"/>
       <w:r>
         <w:rPr>
+          <w:i/>
+          <w:iCs/>
           <w:sz w:val="24"/>
           <w:szCs w:val="24"/>
         </w:rPr>
@@ -172,6 +178,8 @@
       <w:proofErr w:type="spellEnd"/>
       <w:r>
         <w:rPr>
+          <w:i/>
+          <w:iCs/>
           <w:sz w:val="24"/>
           <w:szCs w:val="24"/>
         </w:rPr>
@@ -180,6 +188,8 @@
       <w:proofErr w:type="spellStart"/>
       <w:r>
         <w:rPr>
+          <w:i/>
+          <w:iCs/>
           <w:sz w:val="24"/>
           <w:szCs w:val="24"/>
         </w:rPr>
@@ -188,6 +198,8 @@
       <w:proofErr w:type="spellEnd"/>
       <w:r>
         <w:rPr>
+          <w:i/>
+          <w:iCs/>
           <w:sz w:val="24"/>
           <w:szCs w:val="24"/>
         </w:rPr>
@@ -196,6 +208,8 @@
       <w:proofErr w:type="spellStart"/>
       <w:r>
         <w:rPr>
+          <w:i/>
+          <w:iCs/>
           <w:sz w:val="24"/>
           <w:szCs w:val="24"/>
         </w:rPr>
@@ -204,6 +218,8 @@
       <w:proofErr w:type="spellEnd"/>
       <w:r>
         <w:rPr>
+          <w:i/>
+          <w:iCs/>
           <w:sz w:val="24"/>
           <w:szCs w:val="24"/>
         </w:rPr>
@@ -212,6 +228,8 @@
       <w:proofErr w:type="spellStart"/>
       <w:r>
         <w:rPr>
+          <w:i/>
+          <w:iCs/>
           <w:sz w:val="24"/>
           <w:szCs w:val="24"/>
         </w:rPr>
@@ -220,6 +238,8 @@
       <w:proofErr w:type="spellEnd"/>
       <w:r>
         <w:rPr>
+          <w:i/>
+          <w:iCs/>
           <w:sz w:val="24"/>
           <w:szCs w:val="24"/>
         </w:rPr>
@@ -228,6 +248,8 @@
       <w:proofErr w:type="spellStart"/>
       <w:r>
         <w:rPr>
+          <w:i/>
+          <w:iCs/>
           <w:sz w:val="24"/>
           <w:szCs w:val="24"/>
         </w:rPr>
@@ -236,6 +258,8 @@
       <w:proofErr w:type="spellEnd"/>
       <w:r>
         <w:rPr>
+          <w:i/>
+          <w:iCs/>
           <w:sz w:val="24"/>
           <w:szCs w:val="24"/>
         </w:rPr>
@@ -244,6 +268,8 @@
       <w:proofErr w:type="spellStart"/>
       <w:r>
         <w:rPr>
+          <w:i/>
+          <w:iCs/>
           <w:sz w:val="24"/>
           <w:szCs w:val="24"/>
         </w:rPr>
@@ -252,6 +278,8 @@
       <w:proofErr w:type="spellEnd"/>
       <w:r>
         <w:rPr>
+          <w:i/>
+          <w:iCs/>
           <w:sz w:val="24"/>
           <w:szCs w:val="24"/>
         </w:rPr>
@@ -260,6 +288,8 @@
       <w:proofErr w:type="spellStart"/>
       <w:r>
         <w:rPr>
+          <w:i/>
+          <w:iCs/>
           <w:sz w:val="24"/>
           <w:szCs w:val="24"/>
         </w:rPr>
@@ -268,6 +298,8 @@
       <w:proofErr w:type="spellEnd"/>
       <w:r>
         <w:rPr>
+          <w:i/>
+          <w:iCs/>
           <w:sz w:val="24"/>
           <w:szCs w:val="24"/>
         </w:rPr>
@@ -276,6 +308,8 @@
       <w:proofErr w:type="spellStart"/>
       <w:r>
         <w:rPr>
+          <w:i/>
+          <w:iCs/>
           <w:sz w:val="24"/>
           <w:szCs w:val="24"/>
         </w:rPr>
@@ -284,6 +318,8 @@
       <w:proofErr w:type="spellEnd"/>
       <w:r>
         <w:rPr>
+          <w:i/>
+          <w:iCs/>
           <w:sz w:val="24"/>
           <w:szCs w:val="24"/>
         </w:rPr>
@@ -496,6 +532,113 @@
           <w:sz w:val="24"/>
           <w:szCs w:val="24"/>
         </w:rPr>
+        <w:drawing>
+          <wp:inline distT="0" distB="0" distL="0" distR="0" wp14:anchorId="5FA8215A" wp14:editId="18D8C3F6">
+            <wp:extent cx="5733415" cy="1262380"/>
+            <wp:effectExtent l="0" t="0" r="635" b="0"/>
+            <wp:docPr id="612720242" name="Imagem 1" descr="Texto&#10;&#10;O conteúdo gerado por IA pode estar incorreto."/>
+            <wp:cNvGraphicFramePr>
+              <a:graphicFrameLocks xmlns:a="http://schemas.openxmlformats.org/drawingml/2006/main" noChangeAspect="1"/>
+            </wp:cNvGraphicFramePr>
+            <a:graphic xmlns:a="http://schemas.openxmlformats.org/drawingml/2006/main">
+              <a:graphicData uri="http://schemas.openxmlformats.org/drawingml/2006/picture">
+                <pic:pic xmlns:pic="http://schemas.openxmlformats.org/drawingml/2006/picture">
+                  <pic:nvPicPr>
+                    <pic:cNvPr id="612720242" name="Imagem 1" descr="Texto&#10;&#10;O conteúdo gerado por IA pode estar incorreto."/>
+                    <pic:cNvPicPr/>
+                  </pic:nvPicPr>
+                  <pic:blipFill>
+                    <a:blip r:embed="rId7"/>
+                    <a:stretch>
+                      <a:fillRect/>
+                    </a:stretch>
+                  </pic:blipFill>
+                  <pic:spPr>
+                    <a:xfrm>
+                      <a:off x="0" y="0"/>
+                      <a:ext cx="5733415" cy="1262380"/>
+                    </a:xfrm>
+                    <a:prstGeom prst="rect">
+                      <a:avLst/>
+                    </a:prstGeom>
+                  </pic:spPr>
+                </pic:pic>
+              </a:graphicData>
+            </a:graphic>
+          </wp:inline>
+        </w:drawing>
+      </w:r>
+    </w:p>
+    <w:p>
+      <w:pPr>
+        <w:spacing w:before="240" w:after="240"/>
+        <w:ind w:left="360"/>
+        <w:jc w:val="center"/>
+        <w:rPr>
+          <w:sz w:val="20"/>
+          <w:szCs w:val="20"/>
+        </w:rPr>
+      </w:pPr>
+      <w:r>
+        <w:rPr>
+          <w:sz w:val="20"/>
+          <w:szCs w:val="20"/>
+        </w:rPr>
+        <w:t xml:space="preserve">Figura 1. </w:t>
+      </w:r>
+      <w:r>
+        <w:rPr>
+          <w:sz w:val="20"/>
+          <w:szCs w:val="20"/>
+        </w:rPr>
+        <w:t xml:space="preserve">Captura de tela do </w:t>
+      </w:r>
+      <w:r>
+        <w:rPr>
+          <w:sz w:val="20"/>
+          <w:szCs w:val="20"/>
+        </w:rPr>
+        <w:t>Python Shell</w:t>
+      </w:r>
+      <w:r>
+        <w:rPr>
+          <w:sz w:val="20"/>
+          <w:szCs w:val="20"/>
+        </w:rPr>
+        <w:t xml:space="preserve"> rodando no Prompt de Comando, esse eu sei que sai com </w:t>
+      </w:r>
+      <w:proofErr w:type="spellStart"/>
+      <w:r>
+        <w:rPr>
+          <w:sz w:val="20"/>
+          <w:szCs w:val="20"/>
+        </w:rPr>
+        <w:t>Ctrl+Z</w:t>
+      </w:r>
+      <w:proofErr w:type="spellEnd"/>
+      <w:r>
+        <w:rPr>
+          <w:sz w:val="20"/>
+          <w:szCs w:val="20"/>
+        </w:rPr>
+        <w:t>. (autoria própria)</w:t>
+      </w:r>
+    </w:p>
+    <w:p>
+      <w:pPr>
+        <w:spacing w:before="240" w:after="240"/>
+        <w:ind w:left="360"/>
+        <w:jc w:val="both"/>
+        <w:rPr>
+          <w:sz w:val="24"/>
+          <w:szCs w:val="24"/>
+        </w:rPr>
+      </w:pPr>
+      <w:r>
+        <w:rPr>
+          <w:sz w:val="24"/>
+          <w:szCs w:val="24"/>
+        </w:rPr>
         <w:t xml:space="preserve">Já o </w:t>
       </w:r>
       <w:proofErr w:type="spellStart"/>
@@ -529,6 +672,93 @@
           <w:szCs w:val="24"/>
         </w:rPr>
         <w:t xml:space="preserve"> são construídos.</w:t>
+      </w:r>
+    </w:p>
+    <w:p>
+      <w:pPr>
+        <w:spacing w:before="240" w:after="240"/>
+        <w:ind w:left="360"/>
+        <w:jc w:val="both"/>
+        <w:rPr>
+          <w:sz w:val="24"/>
+          <w:szCs w:val="24"/>
+        </w:rPr>
+      </w:pPr>
+      <w:r>
+        <w:rPr>
+          <w:sz w:val="24"/>
+          <w:szCs w:val="24"/>
+        </w:rPr>
+        <w:lastRenderedPageBreak/>
+        <w:drawing>
+          <wp:inline distT="0" distB="0" distL="0" distR="0" wp14:anchorId="165D3A5D" wp14:editId="7AB17F49">
+            <wp:extent cx="5733415" cy="1996440"/>
+            <wp:effectExtent l="0" t="0" r="635" b="3810"/>
+            <wp:docPr id="109833424" name="Imagem 1" descr="Texto&#10;&#10;O conteúdo gerado por IA pode estar incorreto."/>
+            <wp:cNvGraphicFramePr>
+              <a:graphicFrameLocks xmlns:a="http://schemas.openxmlformats.org/drawingml/2006/main" noChangeAspect="1"/>
+            </wp:cNvGraphicFramePr>
+            <a:graphic xmlns:a="http://schemas.openxmlformats.org/drawingml/2006/main">
+              <a:graphicData uri="http://schemas.openxmlformats.org/drawingml/2006/picture">
+                <pic:pic xmlns:pic="http://schemas.openxmlformats.org/drawingml/2006/picture">
+                  <pic:nvPicPr>
+                    <pic:cNvPr id="109833424" name="Imagem 1" descr="Texto&#10;&#10;O conteúdo gerado por IA pode estar incorreto."/>
+                    <pic:cNvPicPr/>
+                  </pic:nvPicPr>
+                  <pic:blipFill>
+                    <a:blip r:embed="rId8"/>
+                    <a:stretch>
+                      <a:fillRect/>
+                    </a:stretch>
+                  </pic:blipFill>
+                  <pic:spPr>
+                    <a:xfrm>
+                      <a:off x="0" y="0"/>
+                      <a:ext cx="5733415" cy="1996440"/>
+                    </a:xfrm>
+                    <a:prstGeom prst="rect">
+                      <a:avLst/>
+                    </a:prstGeom>
+                  </pic:spPr>
+                </pic:pic>
+              </a:graphicData>
+            </a:graphic>
+          </wp:inline>
+        </w:drawing>
+      </w:r>
+    </w:p>
+    <w:p>
+      <w:pPr>
+        <w:spacing w:before="240" w:after="240"/>
+        <w:ind w:left="360"/>
+        <w:jc w:val="center"/>
+        <w:rPr>
+          <w:sz w:val="20"/>
+          <w:szCs w:val="20"/>
+        </w:rPr>
+      </w:pPr>
+      <w:r>
+        <w:rPr>
+          <w:sz w:val="20"/>
+          <w:szCs w:val="20"/>
+        </w:rPr>
+        <w:t xml:space="preserve">Figura 2. Captura de tela do Prompt de Comando rodando o </w:t>
+      </w:r>
+      <w:proofErr w:type="spellStart"/>
+      <w:r>
+        <w:rPr>
+          <w:sz w:val="20"/>
+          <w:szCs w:val="20"/>
+        </w:rPr>
+        <w:t>IPython</w:t>
+      </w:r>
+      <w:proofErr w:type="spellEnd"/>
+      <w:r>
+        <w:rPr>
+          <w:sz w:val="20"/>
+          <w:szCs w:val="20"/>
+        </w:rPr>
+        <w:t>, OBS.: Não sei sair dele. (autoria própria)</w:t>
       </w:r>
     </w:p>
     <w:p>
@@ -717,6 +947,86 @@
     </w:p>
     <w:p>
       <w:pPr>
+        <w:spacing w:before="240" w:after="240"/>
+        <w:jc w:val="both"/>
+        <w:rPr>
+          <w:sz w:val="24"/>
+          <w:szCs w:val="24"/>
+        </w:rPr>
+      </w:pPr>
+      <w:r>
+        <w:drawing>
+          <wp:inline distT="0" distB="0" distL="0" distR="0" wp14:anchorId="6BCC76BE" wp14:editId="66F5E39F">
+            <wp:extent cx="5733415" cy="2856230"/>
+            <wp:effectExtent l="0" t="0" r="635" b="1270"/>
+            <wp:docPr id="1794501829" name="Imagem 1" descr="Interface gráfica do usuário, Texto, Aplicativo, Email&#10;&#10;O conteúdo gerado por IA pode estar incorreto."/>
+            <wp:cNvGraphicFramePr>
+              <a:graphicFrameLocks xmlns:a="http://schemas.openxmlformats.org/drawingml/2006/main" noChangeAspect="1"/>
+            </wp:cNvGraphicFramePr>
+            <a:graphic xmlns:a="http://schemas.openxmlformats.org/drawingml/2006/main">
+              <a:graphicData uri="http://schemas.openxmlformats.org/drawingml/2006/picture">
+                <pic:pic xmlns:pic="http://schemas.openxmlformats.org/drawingml/2006/picture">
+                  <pic:nvPicPr>
+                    <pic:cNvPr id="1794501829" name="Imagem 1" descr="Interface gráfica do usuário, Texto, Aplicativo, Email&#10;&#10;O conteúdo gerado por IA pode estar incorreto."/>
+                    <pic:cNvPicPr/>
+                  </pic:nvPicPr>
+                  <pic:blipFill>
+                    <a:blip r:embed="rId9"/>
+                    <a:stretch>
+                      <a:fillRect/>
+                    </a:stretch>
+                  </pic:blipFill>
+                  <pic:spPr>
+                    <a:xfrm>
+                      <a:off x="0" y="0"/>
+                      <a:ext cx="5733415" cy="2856230"/>
+                    </a:xfrm>
+                    <a:prstGeom prst="rect">
+                      <a:avLst/>
+                    </a:prstGeom>
+                  </pic:spPr>
+                </pic:pic>
+              </a:graphicData>
+            </a:graphic>
+          </wp:inline>
+        </w:drawing>
+      </w:r>
+    </w:p>
+    <w:p>
+      <w:pPr>
+        <w:spacing w:before="240" w:after="240"/>
+        <w:jc w:val="center"/>
+        <w:rPr>
+          <w:sz w:val="20"/>
+          <w:szCs w:val="20"/>
+        </w:rPr>
+      </w:pPr>
+      <w:r>
+        <w:rPr>
+          <w:sz w:val="20"/>
+          <w:szCs w:val="20"/>
+        </w:rPr>
+        <w:t xml:space="preserve">Figura 3. Captura de tela do </w:t>
+      </w:r>
+      <w:proofErr w:type="spellStart"/>
+      <w:r>
+        <w:rPr>
+          <w:sz w:val="20"/>
+          <w:szCs w:val="20"/>
+        </w:rPr>
+        <w:t>Jupyter</w:t>
+      </w:r>
+      <w:proofErr w:type="spellEnd"/>
+      <w:r>
+        <w:rPr>
+          <w:sz w:val="20"/>
+          <w:szCs w:val="20"/>
+        </w:rPr>
+        <w:t xml:space="preserve"> Notebook, é de um notebook do card 8. (autoria própria)</w:t>
+      </w:r>
+    </w:p>
+    <w:p>
+      <w:pPr>
         <w:pStyle w:val="PargrafodaLista"/>
         <w:numPr>
           <w:ilvl w:val="1"/>
@@ -768,6 +1078,125 @@
         </w:rPr>
       </w:pPr>
       <w:r>
+        <w:drawing>
+          <wp:inline distT="0" distB="0" distL="0" distR="0" wp14:anchorId="785D5CDC" wp14:editId="51F00FA9">
+            <wp:extent cx="5733415" cy="4009390"/>
+            <wp:effectExtent l="0" t="0" r="635" b="0"/>
+            <wp:docPr id="449612812" name="Imagem 1" descr="Interface gráfica do usuário, Texto, Aplicativo, Email&#10;&#10;O conteúdo gerado por IA pode estar incorreto."/>
+            <wp:cNvGraphicFramePr>
+              <a:graphicFrameLocks xmlns:a="http://schemas.openxmlformats.org/drawingml/2006/main" noChangeAspect="1"/>
+            </wp:cNvGraphicFramePr>
+            <a:graphic xmlns:a="http://schemas.openxmlformats.org/drawingml/2006/main">
+              <a:graphicData uri="http://schemas.openxmlformats.org/drawingml/2006/picture">
+                <pic:pic xmlns:pic="http://schemas.openxmlformats.org/drawingml/2006/picture">
+                  <pic:nvPicPr>
+                    <pic:cNvPr id="449612812" name="Imagem 1" descr="Interface gráfica do usuário, Texto, Aplicativo, Email&#10;&#10;O conteúdo gerado por IA pode estar incorreto."/>
+                    <pic:cNvPicPr/>
+                  </pic:nvPicPr>
+                  <pic:blipFill>
+                    <a:blip r:embed="rId10"/>
+                    <a:stretch>
+                      <a:fillRect/>
+                    </a:stretch>
+                  </pic:blipFill>
+                  <pic:spPr>
+                    <a:xfrm>
+                      <a:off x="0" y="0"/>
+                      <a:ext cx="5733415" cy="4009390"/>
+                    </a:xfrm>
+                    <a:prstGeom prst="rect">
+                      <a:avLst/>
+                    </a:prstGeom>
+                  </pic:spPr>
+                </pic:pic>
+              </a:graphicData>
+            </a:graphic>
+          </wp:inline>
+        </w:drawing>
+      </w:r>
+    </w:p>
+    <w:p>
+      <w:pPr>
+        <w:spacing w:before="240" w:after="240"/>
+        <w:jc w:val="center"/>
+        <w:rPr>
+          <w:sz w:val="20"/>
+          <w:szCs w:val="20"/>
+        </w:rPr>
+      </w:pPr>
+      <w:r>
+        <w:rPr>
+          <w:sz w:val="20"/>
+          <w:szCs w:val="20"/>
+        </w:rPr>
+        <w:t xml:space="preserve">Figura 4. Captura de tela do </w:t>
+      </w:r>
+      <w:proofErr w:type="spellStart"/>
+      <w:r>
+        <w:rPr>
+          <w:sz w:val="20"/>
+          <w:szCs w:val="20"/>
+        </w:rPr>
+        <w:t>Jupyter</w:t>
+      </w:r>
+      <w:proofErr w:type="spellEnd"/>
+      <w:r>
+        <w:rPr>
+          <w:sz w:val="20"/>
+          <w:szCs w:val="20"/>
+        </w:rPr>
+        <w:t xml:space="preserve"> </w:t>
+      </w:r>
+      <w:proofErr w:type="spellStart"/>
+      <w:r>
+        <w:rPr>
+          <w:sz w:val="20"/>
+          <w:szCs w:val="20"/>
+        </w:rPr>
+        <w:t>Lab</w:t>
+      </w:r>
+      <w:proofErr w:type="spellEnd"/>
+      <w:r>
+        <w:rPr>
+          <w:sz w:val="20"/>
+          <w:szCs w:val="20"/>
+        </w:rPr>
+        <w:t>, do notebook que eu estava escrevendo o</w:t>
+      </w:r>
+      <w:r>
+        <w:rPr>
+          <w:sz w:val="20"/>
+          <w:szCs w:val="20"/>
+        </w:rPr>
+        <w:t xml:space="preserve"> </w:t>
+      </w:r>
+      <w:proofErr w:type="spellStart"/>
+      <w:r>
+        <w:rPr>
+          <w:sz w:val="20"/>
+          <w:szCs w:val="20"/>
+        </w:rPr>
+        <w:t>ipynb</w:t>
+      </w:r>
+      <w:proofErr w:type="spellEnd"/>
+      <w:r>
+        <w:rPr>
+          <w:sz w:val="20"/>
+          <w:szCs w:val="20"/>
+        </w:rPr>
+        <w:t xml:space="preserve"> desse card. (autoria própria)</w:t>
+      </w:r>
+    </w:p>
+    <w:p>
+      <w:pPr>
+        <w:spacing w:before="240" w:after="240"/>
+        <w:jc w:val="both"/>
+        <w:rPr>
+          <w:sz w:val="24"/>
+          <w:szCs w:val="24"/>
+        </w:rPr>
+      </w:pPr>
+      <w:r>
         <w:rPr>
           <w:sz w:val="24"/>
           <w:szCs w:val="24"/>
@@ -865,6 +1294,75 @@
     </w:p>
     <w:p>
       <w:pPr>
+        <w:spacing w:before="240" w:after="240"/>
+        <w:jc w:val="both"/>
+        <w:rPr>
+          <w:sz w:val="24"/>
+          <w:szCs w:val="24"/>
+        </w:rPr>
+      </w:pPr>
+      <w:r>
+        <w:rPr>
+          <w:sz w:val="24"/>
+          <w:szCs w:val="24"/>
+        </w:rPr>
+        <w:lastRenderedPageBreak/>
+        <w:drawing>
+          <wp:inline distT="0" distB="0" distL="0" distR="0" wp14:anchorId="0AB9E8A3" wp14:editId="14949075">
+            <wp:extent cx="5733415" cy="2692400"/>
+            <wp:effectExtent l="0" t="0" r="635" b="0"/>
+            <wp:docPr id="1348264209" name="Imagem 1" descr="Tela de computador com texto preto sobre fundo branco&#10;&#10;O conteúdo gerado por IA pode estar incorreto."/>
+            <wp:cNvGraphicFramePr>
+              <a:graphicFrameLocks xmlns:a="http://schemas.openxmlformats.org/drawingml/2006/main" noChangeAspect="1"/>
+            </wp:cNvGraphicFramePr>
+            <a:graphic xmlns:a="http://schemas.openxmlformats.org/drawingml/2006/main">
+              <a:graphicData uri="http://schemas.openxmlformats.org/drawingml/2006/picture">
+                <pic:pic xmlns:pic="http://schemas.openxmlformats.org/drawingml/2006/picture">
+                  <pic:nvPicPr>
+                    <pic:cNvPr id="1348264209" name="Imagem 1" descr="Tela de computador com texto preto sobre fundo branco&#10;&#10;O conteúdo gerado por IA pode estar incorreto."/>
+                    <pic:cNvPicPr/>
+                  </pic:nvPicPr>
+                  <pic:blipFill>
+                    <a:blip r:embed="rId11"/>
+                    <a:stretch>
+                      <a:fillRect/>
+                    </a:stretch>
+                  </pic:blipFill>
+                  <pic:spPr>
+                    <a:xfrm>
+                      <a:off x="0" y="0"/>
+                      <a:ext cx="5733415" cy="2692400"/>
+                    </a:xfrm>
+                    <a:prstGeom prst="rect">
+                      <a:avLst/>
+                    </a:prstGeom>
+                  </pic:spPr>
+                </pic:pic>
+              </a:graphicData>
+            </a:graphic>
+          </wp:inline>
+        </w:drawing>
+      </w:r>
+    </w:p>
+    <w:p>
+      <w:pPr>
+        <w:spacing w:before="240" w:after="240"/>
+        <w:jc w:val="center"/>
+        <w:rPr>
+          <w:sz w:val="20"/>
+          <w:szCs w:val="20"/>
+        </w:rPr>
+      </w:pPr>
+      <w:r>
+        <w:rPr>
+          <w:sz w:val="20"/>
+          <w:szCs w:val="20"/>
+        </w:rPr>
+        <w:t>Figura 5. Captura de tela do Google Colab, também importei um arquivo CSV para mostrar a conexão direta com o seu Drive. (autoria própria)</w:t>
+      </w:r>
+    </w:p>
+    <w:p>
+      <w:pPr>
         <w:pStyle w:val="PargrafodaLista"/>
         <w:numPr>
           <w:ilvl w:val="0"/>
@@ -955,6 +1453,124 @@
           <w:szCs w:val="24"/>
         </w:rPr>
         <w:t xml:space="preserve"> públicos diretamente ao notebook e tem como um diferencial onde exige a execução linear, ou seja, do início ao fim, para salvar versões e permite o usuário compartilhar o código publicamente na plataforma.</w:t>
+      </w:r>
+    </w:p>
+    <w:p>
+      <w:pPr>
+        <w:spacing w:before="240" w:after="240"/>
+        <w:jc w:val="both"/>
+        <w:rPr>
+          <w:sz w:val="24"/>
+          <w:szCs w:val="24"/>
+        </w:rPr>
+      </w:pPr>
+      <w:r>
+        <w:rPr>
+          <w:sz w:val="24"/>
+          <w:szCs w:val="24"/>
+        </w:rPr>
+        <w:drawing>
+          <wp:inline distT="0" distB="0" distL="0" distR="0" wp14:anchorId="6831F18D" wp14:editId="78C998F7">
+            <wp:extent cx="5733415" cy="2439670"/>
+            <wp:effectExtent l="0" t="0" r="635" b="0"/>
+            <wp:docPr id="660413944" name="Imagem 1" descr="Tela de computador com jogo&#10;&#10;O conteúdo gerado por IA pode estar incorreto."/>
+            <wp:cNvGraphicFramePr>
+              <a:graphicFrameLocks xmlns:a="http://schemas.openxmlformats.org/drawingml/2006/main" noChangeAspect="1"/>
+            </wp:cNvGraphicFramePr>
+            <a:graphic xmlns:a="http://schemas.openxmlformats.org/drawingml/2006/main">
+              <a:graphicData uri="http://schemas.openxmlformats.org/drawingml/2006/picture">
+                <pic:pic xmlns:pic="http://schemas.openxmlformats.org/drawingml/2006/picture">
+                  <pic:nvPicPr>
+                    <pic:cNvPr id="660413944" name="Imagem 1" descr="Tela de computador com jogo&#10;&#10;O conteúdo gerado por IA pode estar incorreto."/>
+                    <pic:cNvPicPr/>
+                  </pic:nvPicPr>
+                  <pic:blipFill>
+                    <a:blip r:embed="rId12"/>
+                    <a:stretch>
+                      <a:fillRect/>
+                    </a:stretch>
+                  </pic:blipFill>
+                  <pic:spPr>
+                    <a:xfrm>
+                      <a:off x="0" y="0"/>
+                      <a:ext cx="5733415" cy="2439670"/>
+                    </a:xfrm>
+                    <a:prstGeom prst="rect">
+                      <a:avLst/>
+                    </a:prstGeom>
+                  </pic:spPr>
+                </pic:pic>
+              </a:graphicData>
+            </a:graphic>
+          </wp:inline>
+        </w:drawing>
+      </w:r>
+    </w:p>
+    <w:p>
+      <w:pPr>
+        <w:spacing w:before="240" w:after="240"/>
+        <w:jc w:val="center"/>
+        <w:rPr>
+          <w:sz w:val="20"/>
+          <w:szCs w:val="20"/>
+        </w:rPr>
+      </w:pPr>
+      <w:r>
+        <w:rPr>
+          <w:sz w:val="20"/>
+          <w:szCs w:val="20"/>
+        </w:rPr>
+        <w:t xml:space="preserve">Figura 6. Captura de tela do </w:t>
+      </w:r>
+      <w:proofErr w:type="spellStart"/>
+      <w:r>
+        <w:rPr>
+          <w:sz w:val="20"/>
+          <w:szCs w:val="20"/>
+        </w:rPr>
+        <w:t>Kaggle</w:t>
+      </w:r>
+      <w:proofErr w:type="spellEnd"/>
+      <w:r>
+        <w:rPr>
+          <w:sz w:val="20"/>
+          <w:szCs w:val="20"/>
+        </w:rPr>
+        <w:t xml:space="preserve">, eu ia usar o mesmo </w:t>
+      </w:r>
+      <w:proofErr w:type="spellStart"/>
+      <w:r>
+        <w:rPr>
+          <w:i/>
+          <w:iCs/>
+          <w:sz w:val="20"/>
+          <w:szCs w:val="20"/>
+        </w:rPr>
+        <w:t>dataset</w:t>
+      </w:r>
+      <w:proofErr w:type="spellEnd"/>
+      <w:r>
+        <w:rPr>
+          <w:sz w:val="20"/>
+          <w:szCs w:val="20"/>
+        </w:rPr>
+        <w:t xml:space="preserve"> do Colab, mas esqueci de salvar ele no </w:t>
+      </w:r>
+      <w:proofErr w:type="spellStart"/>
+      <w:r>
+        <w:rPr>
+          <w:sz w:val="20"/>
+          <w:szCs w:val="20"/>
+        </w:rPr>
+        <w:t>Kaggle</w:t>
+      </w:r>
+      <w:proofErr w:type="spellEnd"/>
+      <w:r>
+        <w:rPr>
+          <w:sz w:val="20"/>
+          <w:szCs w:val="20"/>
+        </w:rPr>
+        <w:t>. (autoria própria)</w:t>
       </w:r>
     </w:p>
     <w:p>
@@ -1094,6 +1710,7 @@
               <w:rPr>
                 <w:caps w:val="0"/>
               </w:rPr>
+              <w:lastRenderedPageBreak/>
               <w:t>Instalação Local</w:t>
             </w:r>
           </w:p>
@@ -1493,14 +2110,14 @@
       </w:pPr>
       <w:r>
         <w:rPr>
-          <w:sz w:val="24"/>
-          <w:szCs w:val="24"/>
-        </w:rPr>
-        <w:lastRenderedPageBreak/>
+          <w:noProof/>
+          <w:sz w:val="24"/>
+          <w:szCs w:val="24"/>
+        </w:rPr>
         <w:drawing>
-          <wp:inline distT="0" distB="0" distL="0" distR="0" wp14:anchorId="2AB85702" wp14:editId="487A9C22">
-            <wp:extent cx="2971800" cy="6019800"/>
-            <wp:effectExtent l="0" t="0" r="0" b="0"/>
+          <wp:inline distT="0" distB="0" distL="0" distR="0" wp14:anchorId="2AB85702" wp14:editId="1AD124D0">
+            <wp:extent cx="2519760" cy="5104130"/>
+            <wp:effectExtent l="0" t="0" r="0" b="1270"/>
             <wp:docPr id="1767244174" name="Imagem 6" descr="Forma&#10;&#10;O conteúdo gerado por IA pode estar incorreto."/>
             <wp:cNvGraphicFramePr>
               <a:graphicFrameLocks xmlns:a="http://schemas.openxmlformats.org/drawingml/2006/main" noChangeAspect="1"/>
@@ -1515,7 +2132,7 @@
                     </pic:cNvPicPr>
                   </pic:nvPicPr>
                   <pic:blipFill>
-                    <a:blip r:embed="rId7">
+                    <a:blip r:embed="rId13">
                       <a:extLst>
                         <a:ext uri="{28A0092B-C50C-407E-A947-70E740481C1C}">
                           <a14:useLocalDpi xmlns:a14="http://schemas.microsoft.com/office/drawing/2010/main" val="0"/>
@@ -1530,7 +2147,7 @@
                   <pic:spPr bwMode="auto">
                     <a:xfrm>
                       <a:off x="0" y="0"/>
-                      <a:ext cx="2971800" cy="6019800"/>
+                      <a:ext cx="2528733" cy="5122307"/>
                     </a:xfrm>
                     <a:prstGeom prst="rect">
                       <a:avLst/>
@@ -1589,6 +2206,7 @@
           <w:sz w:val="34"/>
           <w:szCs w:val="34"/>
         </w:rPr>
+        <w:lastRenderedPageBreak/>
         <w:t>3. Conclusão</w:t>
       </w:r>
     </w:p>
@@ -1746,7 +2364,6 @@
           <w:sz w:val="24"/>
           <w:szCs w:val="24"/>
         </w:rPr>
-        <w:lastRenderedPageBreak/>
         <w:t xml:space="preserve">Referências: </w:t>
       </w:r>
     </w:p>
@@ -1975,7 +2592,7 @@
       </w:r>
     </w:p>
     <w:sectPr>
-      <w:headerReference w:type="default" r:id="rId8"/>
+      <w:headerReference w:type="default" r:id="rId14"/>
       <w:pgSz w:w="11909" w:h="16834"/>
       <w:pgMar w:top="1440" w:right="1440" w:bottom="1440" w:left="1440" w:header="720" w:footer="720" w:gutter="0"/>
       <w:pgNumType w:start="1"/>
@@ -3653,6 +4270,7 @@
   <w:style w:type="character" w:default="1" w:styleId="Fontepargpadro">
     <w:name w:val="Default Paragraph Font"/>
     <w:uiPriority w:val="1"/>
+    <w:semiHidden/>
     <w:unhideWhenUsed/>
   </w:style>
   <w:style w:type="table" w:default="1" w:styleId="Tabelanormal">

</xml_diff>